<commit_message>
feat: Implement new dashboard sections for KPIs, map, evolution, clustering, predictive factors, and data tables, updating the base template and adding report files.
</commit_message>
<xml_diff>
--- a/03_SEMESTRE/03_SeminarioInnovacionAnalisisVisualizacionDatos/DESARROLLO INFORME/Trabajo_Final_Desarrollo_Fase3.docx
+++ b/03_SEMESTRE/03_SeminarioInnovacionAnalisisVisualizacionDatos/DESARROLLO INFORME/Trabajo_Final_Desarrollo_Fase3.docx
@@ -23823,13 +23823,137 @@
         <w:tab/>
       </w:r>
       <w:r>
-        <w:t>El objetivo analítico culmina en la conceptualización del Monitor de Vulnerabilidad Educativa. Atendiendo a las directrices del proyecto, se define este "Monitor" como: Un sistema de inteligencia de datos territoriales que transforma indicadores estadísticos rezagados</w:t>
-      </w:r>
-      <w:r>
-        <w:t xml:space="preserve"> </w:t>
-      </w:r>
-      <w:r>
-        <w:t>en un tablero de control visual y dinámico, permitiendo a los tomadores de decisiones anticipar el riesgo de deserción escolar basándose en el comportamiento de las carencias sociales de cada región.</w:t>
+        <w:t>El objetivo analítico del proyecto culmina con el</w:t>
+      </w:r>
+      <w:r>
+        <w:t xml:space="preserve"> desarrollo del </w:t>
+      </w:r>
+      <w:proofErr w:type="spellStart"/>
+      <w:r>
+        <w:t>dashboard</w:t>
+      </w:r>
+      <w:proofErr w:type="spellEnd"/>
+      <w:r>
+        <w:t xml:space="preserve"> del</w:t>
+      </w:r>
+      <w:r>
+        <w:t xml:space="preserve"> "Monitor de Vulnerabilidad Educativa y Abandono Escolar (2021-2024)</w:t>
+      </w:r>
+      <w:r>
+        <w:t xml:space="preserve"> en escuelas primarias</w:t>
+      </w:r>
+      <w:r>
+        <w:t>". Atendiendo a las directrices estratégicas del estudio, se define este Monitor como: Un sistema de inteligencia de datos territoriales que transforma indicadores estadísticos rezagados en un tablero de control visual y dinámico, permitiendo a los tomadores de decisiones anticipar el riesgo de deserción escolar basándose en el comportamiento estructural de las carencias sociales.</w:t>
+      </w:r>
+    </w:p>
+    <w:p>
+      <w:r>
+        <w:t>La interfaz visual se estructura en los siguientes componentes clave:</w:t>
+      </w:r>
+    </w:p>
+    <w:p>
+      <w:pPr>
+        <w:pStyle w:val="Prrafodelista"/>
+        <w:numPr>
+          <w:ilvl w:val="0"/>
+          <w:numId w:val="56"/>
+        </w:numPr>
+      </w:pPr>
+      <w:r>
+        <w:t>Panel de Alertas Inteligentes (</w:t>
+      </w:r>
+      <w:proofErr w:type="spellStart"/>
+      <w:r>
+        <w:t>KPIs</w:t>
+      </w:r>
+      <w:proofErr w:type="spellEnd"/>
+      <w:r>
+        <w:t xml:space="preserve">): Muestra el promedio nacional o estatal. Destaca la programación de un formato condicional basado en el hallazgo del </w:t>
+      </w:r>
+      <w:proofErr w:type="spellStart"/>
+      <w:r>
+        <w:t>Random</w:t>
+      </w:r>
+      <w:proofErr w:type="spellEnd"/>
+      <w:r>
+        <w:t xml:space="preserve"> Forest: al registrar una CARENCIA_SALUD del 59.82% (superando el umbral crítico del 50%), el sistema activa automáticamente una alerta roja que indica "¡Alerta: </w:t>
+      </w:r>
+      <w:proofErr w:type="gramStart"/>
+      <w:r>
+        <w:t>Alto riesgo de abandono escolar!</w:t>
+      </w:r>
+      <w:proofErr w:type="gramEnd"/>
+      <w:r>
+        <w:t>".</w:t>
+      </w:r>
+    </w:p>
+    <w:p>
+      <w:pPr>
+        <w:pStyle w:val="Prrafodelista"/>
+        <w:numPr>
+          <w:ilvl w:val="0"/>
+          <w:numId w:val="56"/>
+        </w:numPr>
+      </w:pPr>
+      <w:r>
+        <w:t xml:space="preserve">Mapas </w:t>
+      </w:r>
+      <w:proofErr w:type="spellStart"/>
+      <w:r>
+        <w:t>Coropléticos</w:t>
+      </w:r>
+      <w:proofErr w:type="spellEnd"/>
+      <w:r>
+        <w:t xml:space="preserve"> Comparativos: Se presentan dos mapas de México en paralelo, uno ilustrando la geografía del abandono y otro la geografía de la carencia en salud. Visualmente, las "zonas calientes" (tonos rojos) en el sur del país coinciden en ambos mapas, evidenciando la correlación territorial.</w:t>
+      </w:r>
+    </w:p>
+    <w:p>
+      <w:pPr>
+        <w:pStyle w:val="Prrafodelista"/>
+        <w:numPr>
+          <w:ilvl w:val="0"/>
+          <w:numId w:val="56"/>
+        </w:numPr>
+      </w:pPr>
+      <w:r>
+        <w:t>Evolución Temporal (Convergencia / Divergencia): Un gráfico de líneas interactivo que responde a la directriz de analizar la dinámica temporal (2021-2024), mostrando cómo la tendencia del abandono experimentó una caída (convergencia) hacia 2023, seguida de un rebote o divergencia en 2024.</w:t>
+      </w:r>
+    </w:p>
+    <w:p>
+      <w:pPr>
+        <w:pStyle w:val="Prrafodelista"/>
+        <w:numPr>
+          <w:ilvl w:val="0"/>
+          <w:numId w:val="56"/>
+        </w:numPr>
+      </w:pPr>
+      <w:r>
+        <w:lastRenderedPageBreak/>
+        <w:t xml:space="preserve">Integración de Machine </w:t>
+      </w:r>
+      <w:proofErr w:type="spellStart"/>
+      <w:r>
+        <w:t>Learning</w:t>
+      </w:r>
+      <w:proofErr w:type="spellEnd"/>
+      <w:r>
+        <w:t xml:space="preserve"> en Producción: La zona inferior del monitor expone los algoritmos desarrollados: el gráfico de barras estático del </w:t>
+      </w:r>
+      <w:proofErr w:type="spellStart"/>
+      <w:r>
+        <w:t>Random</w:t>
+      </w:r>
+      <w:proofErr w:type="spellEnd"/>
+      <w:r>
+        <w:t xml:space="preserve"> Forest (jerarquía de importancia) y el gráfico de dispersión dinámico del K-</w:t>
+      </w:r>
+      <w:proofErr w:type="spellStart"/>
+      <w:r>
+        <w:t>Means</w:t>
+      </w:r>
+      <w:proofErr w:type="spellEnd"/>
+      <w:r>
+        <w:t xml:space="preserve"> que agrupa a los estados por perfil de vulnerabilidad</w:t>
       </w:r>
     </w:p>
     <w:p>
@@ -23848,6 +23972,81 @@
       </w:r>
     </w:p>
     <w:p>
+      <w:r>
+        <w:tab/>
+      </w:r>
+      <w:r>
+        <w:t xml:space="preserve">La relevancia científica y social de estos resultados radica en el cambio de paradigma sobre las causas de la deserción escolar </w:t>
+      </w:r>
+      <w:proofErr w:type="gramStart"/>
+      <w:r>
+        <w:t>post-pandemia</w:t>
+      </w:r>
+      <w:proofErr w:type="gramEnd"/>
+      <w:r>
+        <w:t>.</w:t>
+      </w:r>
+    </w:p>
+    <w:p>
+      <w:pPr>
+        <w:pStyle w:val="Prrafodelista"/>
+        <w:numPr>
+          <w:ilvl w:val="0"/>
+          <w:numId w:val="57"/>
+        </w:numPr>
+      </w:pPr>
+      <w:r>
+        <w:t xml:space="preserve">El impacto del "Shock de Salud": El tablero visual confirma que la crisis de infraestructura sanitaria es </w:t>
+      </w:r>
+      <w:proofErr w:type="gramStart"/>
+      <w:r>
+        <w:t>considerado</w:t>
+      </w:r>
+      <w:proofErr w:type="gramEnd"/>
+      <w:r>
+        <w:t xml:space="preserve"> como el valor causa efecto como el </w:t>
+      </w:r>
+      <w:r>
+        <w:t xml:space="preserve">principal del sistema educativo. El modelo de </w:t>
+      </w:r>
+      <w:proofErr w:type="spellStart"/>
+      <w:r>
+        <w:t>Random</w:t>
+      </w:r>
+      <w:proofErr w:type="spellEnd"/>
+      <w:r>
+        <w:t xml:space="preserve"> Forest posiciona la salud con una importancia máxima de 0.22. La relevancia de este hallazgo indica que la vulnerabilidad se ha vuelto multidimensional; otorgar becas en efectivo no retendrá a los estudiantes si las familias deben desviar ese ingreso para cubrir atenciones médicas privadas ante el colapso del sistema público.</w:t>
+      </w:r>
+    </w:p>
+    <w:p>
+      <w:pPr>
+        <w:pStyle w:val="Prrafodelista"/>
+        <w:numPr>
+          <w:ilvl w:val="0"/>
+          <w:numId w:val="57"/>
+        </w:numPr>
+      </w:pPr>
+      <w:r>
+        <w:t xml:space="preserve">Segmentación del Riesgo: El </w:t>
+      </w:r>
+      <w:proofErr w:type="spellStart"/>
+      <w:r>
+        <w:t>Clustering</w:t>
+      </w:r>
+      <w:proofErr w:type="spellEnd"/>
+      <w:r>
+        <w:t xml:space="preserve"> K-</w:t>
+      </w:r>
+      <w:proofErr w:type="spellStart"/>
+      <w:r>
+        <w:t>Means</w:t>
+      </w:r>
+      <w:proofErr w:type="spellEnd"/>
+      <w:r>
+        <w:t xml:space="preserve"> demostró que los estados no se distribuyen uniformemente, sino que se fracturan en perfiles de riesgo claro (Riesgo Moderado vs. Riesgo Crítico). Esto es vital para la política pública, ya que justifica dejar de aplicar "soluciones nacionales estandarizadas" para transitar hacia intervenciones focalizadas por clúster territorial.</w:t>
+      </w:r>
+    </w:p>
+    <w:p>
       <w:pPr>
         <w:pStyle w:val="Ttulo3"/>
       </w:pPr>
@@ -23863,6 +24062,95 @@
       </w:r>
     </w:p>
     <w:p>
+      <w:r>
+        <w:tab/>
+      </w:r>
+      <w:r>
+        <w:t>El desarrollo del proyecto cumplió satisfactoriamente con los cuatro objetivos planteados en la Fase 1:</w:t>
+      </w:r>
+    </w:p>
+    <w:p>
+      <w:pPr>
+        <w:pStyle w:val="Prrafodelista"/>
+        <w:numPr>
+          <w:ilvl w:val="0"/>
+          <w:numId w:val="58"/>
+        </w:numPr>
+      </w:pPr>
+      <w:r>
+        <w:t>Integración y Procesamiento de Datos (ETL): Cumplido. Se construyó con éxito la Matriz de Datos Analítica, transformando fuentes horizontales del CONEVAL/INEGI a un formato vertical (Panel Data) e integrando las cifras de la SEP.</w:t>
+      </w:r>
+    </w:p>
+    <w:p>
+      <w:pPr>
+        <w:pStyle w:val="Prrafodelista"/>
+        <w:numPr>
+          <w:ilvl w:val="0"/>
+          <w:numId w:val="58"/>
+        </w:numPr>
+      </w:pPr>
+      <w:r>
+        <w:t>Análisis Exploratorio de Datos (EDA): Cumplido. Se validó estadísticamente la ausencia de linealidad pura mediante mapas de calor, justificando el uso de modelos avanzados.</w:t>
+      </w:r>
+    </w:p>
+    <w:p>
+      <w:pPr>
+        <w:pStyle w:val="Prrafodelista"/>
+        <w:numPr>
+          <w:ilvl w:val="0"/>
+          <w:numId w:val="58"/>
+        </w:numPr>
+      </w:pPr>
+      <w:r>
+        <w:t xml:space="preserve">Modelado y Clasificación de Riesgo: Cumplido con Ajuste Diagnóstico. Aunque el "ruido administrativo" de la SEP (tasas negativas por reinscripciones) limitó la precisión </w:t>
+      </w:r>
+      <w:r>
+        <w:lastRenderedPageBreak/>
+        <w:t xml:space="preserve">numérica exacta, el ensamble de </w:t>
+      </w:r>
+      <w:proofErr w:type="spellStart"/>
+      <w:r>
+        <w:t>Random</w:t>
+      </w:r>
+      <w:proofErr w:type="spellEnd"/>
+      <w:r>
+        <w:t xml:space="preserve"> Forest logró cabalmente el objetivo principal: jerarquizar los factores estructurales.</w:t>
+      </w:r>
+    </w:p>
+    <w:p>
+      <w:pPr>
+        <w:pStyle w:val="Prrafodelista"/>
+        <w:numPr>
+          <w:ilvl w:val="0"/>
+          <w:numId w:val="58"/>
+        </w:numPr>
+      </w:pPr>
+      <w:r>
+        <w:t xml:space="preserve">Visualización Estratégica: Cumplido. El diseño e implementación del Monitor de Vulnerabilidad Educativa mediante </w:t>
+      </w:r>
+      <w:proofErr w:type="spellStart"/>
+      <w:r>
+        <w:t>Flask</w:t>
+      </w:r>
+      <w:proofErr w:type="spellEnd"/>
+      <w:r>
+        <w:t xml:space="preserve"> materializó el conocimiento en una herramienta consumible, cumpliendo explícitamente con las peticiones de inclusión de mapas </w:t>
+      </w:r>
+      <w:proofErr w:type="spellStart"/>
+      <w:r>
+        <w:t>coropléticos</w:t>
+      </w:r>
+      <w:proofErr w:type="spellEnd"/>
+      <w:r>
+        <w:t xml:space="preserve"> y agrupación K-</w:t>
+      </w:r>
+      <w:proofErr w:type="spellStart"/>
+      <w:r>
+        <w:t>Means</w:t>
+      </w:r>
+      <w:proofErr w:type="spellEnd"/>
+    </w:p>
+    <w:p>
       <w:pPr>
         <w:pStyle w:val="Ttulo3"/>
       </w:pPr>
@@ -23877,6 +24165,145 @@
         <w:t xml:space="preserve"> </w:t>
       </w:r>
     </w:p>
+    <w:p>
+      <w:pPr>
+        <w:pStyle w:val="Prrafodelista"/>
+        <w:numPr>
+          <w:ilvl w:val="0"/>
+          <w:numId w:val="59"/>
+        </w:numPr>
+      </w:pPr>
+      <w:r>
+        <w:t xml:space="preserve">La no linealidad del fenómeno: El abandono escolar no crece gradualmente con la pobreza; opera bajo una lógica de umbrales críticos donde el colapso de un servicio primario </w:t>
+      </w:r>
+      <w:r>
+        <w:rPr>
+          <w:b/>
+          <w:bCs/>
+        </w:rPr>
+        <w:t>como rebasar el 50% en carencia de salud</w:t>
+      </w:r>
+      <w:r>
+        <w:t xml:space="preserve"> detona exponencialmente la deserción.</w:t>
+      </w:r>
+    </w:p>
+    <w:p>
+      <w:pPr>
+        <w:pStyle w:val="Prrafodelista"/>
+        <w:numPr>
+          <w:ilvl w:val="0"/>
+          <w:numId w:val="59"/>
+        </w:numPr>
+      </w:pPr>
+      <w:r>
+        <w:t xml:space="preserve">El poder de la </w:t>
+      </w:r>
+      <w:proofErr w:type="spellStart"/>
+      <w:r>
+        <w:t>narrativa</w:t>
+      </w:r>
+      <w:proofErr w:type="spellEnd"/>
+      <w:r>
+        <w:t xml:space="preserve"> sobre la precisión: El proyecto demostró que, en la analítica de políticas públicas, un modelo explicativo (</w:t>
+      </w:r>
+      <w:proofErr w:type="spellStart"/>
+      <w:r>
+        <w:t>Random</w:t>
+      </w:r>
+      <w:proofErr w:type="spellEnd"/>
+      <w:r>
+        <w:t xml:space="preserve"> Forest) que detecta el problema estructural subyacente es mucho más valioso que un modelo estadístico lineal "preciso" pero incapaz de identificar relaciones complejas.</w:t>
+      </w:r>
+    </w:p>
+    <w:p/>
+    <w:p>
+      <w:pPr>
+        <w:pStyle w:val="Prrafodelista"/>
+        <w:numPr>
+          <w:ilvl w:val="0"/>
+          <w:numId w:val="60"/>
+        </w:numPr>
+      </w:pPr>
+      <w:r>
+        <w:t>Oportunidades de Mejora (Trabajo Futuro):</w:t>
+      </w:r>
+    </w:p>
+    <w:p>
+      <w:pPr>
+        <w:pStyle w:val="Prrafodelista"/>
+        <w:numPr>
+          <w:ilvl w:val="0"/>
+          <w:numId w:val="61"/>
+        </w:numPr>
+      </w:pPr>
+      <w:r>
+        <w:t xml:space="preserve">Granularidad Municipal (Mitigación de la Falacia Ecológica): El Monitor actual procesa datos a nivel Entidad Federativa. Una mejora fundamental sería escalar el ecosistema de datos a nivel municipal (más de 2,400 registros) para localizar escuelas y comunidades de forma </w:t>
+      </w:r>
+      <w:proofErr w:type="spellStart"/>
+      <w:r>
+        <w:t>hiperlocal</w:t>
+      </w:r>
+      <w:proofErr w:type="spellEnd"/>
+      <w:r>
+        <w:t>.</w:t>
+      </w:r>
+    </w:p>
+    <w:p>
+      <w:pPr>
+        <w:pStyle w:val="Prrafodelista"/>
+        <w:numPr>
+          <w:ilvl w:val="0"/>
+          <w:numId w:val="61"/>
+        </w:numPr>
+      </w:pPr>
+      <w:r>
+        <w:t>Depuración de la Variable Objetivo (SEP): Es imperativo gestionar un preprocesamiento más profundo de los microdatos de la SEP que permita aislar la "Deserción Bruta" de las "Altas por traslado/reinscripción", eliminando así las tasas negativas que introducen ruido al modelo predictivo.</w:t>
+      </w:r>
+    </w:p>
+    <w:p>
+      <w:pPr>
+        <w:pStyle w:val="Prrafodelista"/>
+        <w:numPr>
+          <w:ilvl w:val="0"/>
+          <w:numId w:val="61"/>
+        </w:numPr>
+      </w:pPr>
+      <w:r>
+        <w:t xml:space="preserve">Automatización mediante </w:t>
+      </w:r>
+      <w:proofErr w:type="spellStart"/>
+      <w:r>
+        <w:t>APIs</w:t>
+      </w:r>
+      <w:proofErr w:type="spellEnd"/>
+      <w:r>
+        <w:t xml:space="preserve">: Evolucionar el </w:t>
+      </w:r>
+      <w:proofErr w:type="spellStart"/>
+      <w:r>
+        <w:t>dashboard</w:t>
+      </w:r>
+      <w:proofErr w:type="spellEnd"/>
+      <w:r>
+        <w:t xml:space="preserve"> actual, que depende de archivos .</w:t>
+      </w:r>
+      <w:proofErr w:type="spellStart"/>
+      <w:r>
+        <w:t>csv</w:t>
+      </w:r>
+      <w:proofErr w:type="spellEnd"/>
+      <w:r>
+        <w:t xml:space="preserve"> estáticos, hacia una arquitectura automatizada que consuma directamente las </w:t>
+      </w:r>
+      <w:proofErr w:type="spellStart"/>
+      <w:r>
+        <w:t>APIs</w:t>
+      </w:r>
+      <w:proofErr w:type="spellEnd"/>
+      <w:r>
+        <w:t xml:space="preserve"> de datos abiertos del gobierno federal, asegurando una actualización en tiempo real del Monitor.</w:t>
+      </w:r>
+    </w:p>
     <w:p/>
     <w:p>
       <w:pPr>
@@ -23888,6 +24315,7 @@
         <w:rPr>
           <w:caps w:val="0"/>
         </w:rPr>
+        <w:lastRenderedPageBreak/>
         <w:t>Conclusiones</w:t>
       </w:r>
       <w:bookmarkEnd w:id="48"/>
@@ -23988,7 +24416,6 @@
         <w:rPr>
           <w:lang w:val="es-ES_tradnl"/>
         </w:rPr>
-        <w:lastRenderedPageBreak/>
         <w:t>Referencias bibliográficas</w:t>
       </w:r>
       <w:bookmarkEnd w:id="54"/>
@@ -27218,6 +27645,95 @@
     </w:lvl>
   </w:abstractNum>
   <w:abstractNum w:abstractNumId="15" w15:restartNumberingAfterBreak="0">
+    <w:nsid w:val="198A7AA2"/>
+    <w:multiLevelType w:val="hybridMultilevel"/>
+    <w:tmpl w:val="059C9E66"/>
+    <w:lvl w:ilvl="0" w:tplc="9B56A510">
+      <w:start w:val="1"/>
+      <w:numFmt w:val="decimal"/>
+      <w:lvlText w:val="%1."/>
+      <w:lvlJc w:val="left"/>
+      <w:pPr>
+        <w:ind w:left="1060" w:hanging="360"/>
+      </w:pPr>
+      <w:rPr>
+        <w:rFonts w:hint="default"/>
+      </w:rPr>
+    </w:lvl>
+    <w:lvl w:ilvl="1" w:tplc="080A0019" w:tentative="1">
+      <w:start w:val="1"/>
+      <w:numFmt w:val="lowerLetter"/>
+      <w:lvlText w:val="%2."/>
+      <w:lvlJc w:val="left"/>
+      <w:pPr>
+        <w:ind w:left="1780" w:hanging="360"/>
+      </w:pPr>
+    </w:lvl>
+    <w:lvl w:ilvl="2" w:tplc="080A001B" w:tentative="1">
+      <w:start w:val="1"/>
+      <w:numFmt w:val="lowerRoman"/>
+      <w:lvlText w:val="%3."/>
+      <w:lvlJc w:val="right"/>
+      <w:pPr>
+        <w:ind w:left="2500" w:hanging="180"/>
+      </w:pPr>
+    </w:lvl>
+    <w:lvl w:ilvl="3" w:tplc="080A000F" w:tentative="1">
+      <w:start w:val="1"/>
+      <w:numFmt w:val="decimal"/>
+      <w:lvlText w:val="%4."/>
+      <w:lvlJc w:val="left"/>
+      <w:pPr>
+        <w:ind w:left="3220" w:hanging="360"/>
+      </w:pPr>
+    </w:lvl>
+    <w:lvl w:ilvl="4" w:tplc="080A0019" w:tentative="1">
+      <w:start w:val="1"/>
+      <w:numFmt w:val="lowerLetter"/>
+      <w:lvlText w:val="%5."/>
+      <w:lvlJc w:val="left"/>
+      <w:pPr>
+        <w:ind w:left="3940" w:hanging="360"/>
+      </w:pPr>
+    </w:lvl>
+    <w:lvl w:ilvl="5" w:tplc="080A001B" w:tentative="1">
+      <w:start w:val="1"/>
+      <w:numFmt w:val="lowerRoman"/>
+      <w:lvlText w:val="%6."/>
+      <w:lvlJc w:val="right"/>
+      <w:pPr>
+        <w:ind w:left="4660" w:hanging="180"/>
+      </w:pPr>
+    </w:lvl>
+    <w:lvl w:ilvl="6" w:tplc="080A000F" w:tentative="1">
+      <w:start w:val="1"/>
+      <w:numFmt w:val="decimal"/>
+      <w:lvlText w:val="%7."/>
+      <w:lvlJc w:val="left"/>
+      <w:pPr>
+        <w:ind w:left="5380" w:hanging="360"/>
+      </w:pPr>
+    </w:lvl>
+    <w:lvl w:ilvl="7" w:tplc="080A0019" w:tentative="1">
+      <w:start w:val="1"/>
+      <w:numFmt w:val="lowerLetter"/>
+      <w:lvlText w:val="%8."/>
+      <w:lvlJc w:val="left"/>
+      <w:pPr>
+        <w:ind w:left="6100" w:hanging="360"/>
+      </w:pPr>
+    </w:lvl>
+    <w:lvl w:ilvl="8" w:tplc="080A001B" w:tentative="1">
+      <w:start w:val="1"/>
+      <w:numFmt w:val="lowerRoman"/>
+      <w:lvlText w:val="%9."/>
+      <w:lvlJc w:val="right"/>
+      <w:pPr>
+        <w:ind w:left="6820" w:hanging="180"/>
+      </w:pPr>
+    </w:lvl>
+  </w:abstractNum>
+  <w:abstractNum w:abstractNumId="16" w15:restartNumberingAfterBreak="0">
     <w:nsid w:val="1B3C7AE4"/>
     <w:multiLevelType w:val="hybridMultilevel"/>
     <w:tmpl w:val="F81ABC08"/>
@@ -27329,7 +27845,96 @@
       </w:rPr>
     </w:lvl>
   </w:abstractNum>
-  <w:abstractNum w:abstractNumId="16" w15:restartNumberingAfterBreak="0">
+  <w:abstractNum w:abstractNumId="17" w15:restartNumberingAfterBreak="0">
+    <w:nsid w:val="1D767B24"/>
+    <w:multiLevelType w:val="hybridMultilevel"/>
+    <w:tmpl w:val="EA72A024"/>
+    <w:lvl w:ilvl="0" w:tplc="080A000F">
+      <w:start w:val="1"/>
+      <w:numFmt w:val="decimal"/>
+      <w:lvlText w:val="%1."/>
+      <w:lvlJc w:val="left"/>
+      <w:pPr>
+        <w:ind w:left="720" w:hanging="360"/>
+      </w:pPr>
+      <w:rPr>
+        <w:rFonts w:hint="default"/>
+      </w:rPr>
+    </w:lvl>
+    <w:lvl w:ilvl="1" w:tplc="080A0019" w:tentative="1">
+      <w:start w:val="1"/>
+      <w:numFmt w:val="lowerLetter"/>
+      <w:lvlText w:val="%2."/>
+      <w:lvlJc w:val="left"/>
+      <w:pPr>
+        <w:ind w:left="1440" w:hanging="360"/>
+      </w:pPr>
+    </w:lvl>
+    <w:lvl w:ilvl="2" w:tplc="080A001B" w:tentative="1">
+      <w:start w:val="1"/>
+      <w:numFmt w:val="lowerRoman"/>
+      <w:lvlText w:val="%3."/>
+      <w:lvlJc w:val="right"/>
+      <w:pPr>
+        <w:ind w:left="2160" w:hanging="180"/>
+      </w:pPr>
+    </w:lvl>
+    <w:lvl w:ilvl="3" w:tplc="080A000F" w:tentative="1">
+      <w:start w:val="1"/>
+      <w:numFmt w:val="decimal"/>
+      <w:lvlText w:val="%4."/>
+      <w:lvlJc w:val="left"/>
+      <w:pPr>
+        <w:ind w:left="2880" w:hanging="360"/>
+      </w:pPr>
+    </w:lvl>
+    <w:lvl w:ilvl="4" w:tplc="080A0019" w:tentative="1">
+      <w:start w:val="1"/>
+      <w:numFmt w:val="lowerLetter"/>
+      <w:lvlText w:val="%5."/>
+      <w:lvlJc w:val="left"/>
+      <w:pPr>
+        <w:ind w:left="3600" w:hanging="360"/>
+      </w:pPr>
+    </w:lvl>
+    <w:lvl w:ilvl="5" w:tplc="080A001B" w:tentative="1">
+      <w:start w:val="1"/>
+      <w:numFmt w:val="lowerRoman"/>
+      <w:lvlText w:val="%6."/>
+      <w:lvlJc w:val="right"/>
+      <w:pPr>
+        <w:ind w:left="4320" w:hanging="180"/>
+      </w:pPr>
+    </w:lvl>
+    <w:lvl w:ilvl="6" w:tplc="080A000F" w:tentative="1">
+      <w:start w:val="1"/>
+      <w:numFmt w:val="decimal"/>
+      <w:lvlText w:val="%7."/>
+      <w:lvlJc w:val="left"/>
+      <w:pPr>
+        <w:ind w:left="5040" w:hanging="360"/>
+      </w:pPr>
+    </w:lvl>
+    <w:lvl w:ilvl="7" w:tplc="080A0019" w:tentative="1">
+      <w:start w:val="1"/>
+      <w:numFmt w:val="lowerLetter"/>
+      <w:lvlText w:val="%8."/>
+      <w:lvlJc w:val="left"/>
+      <w:pPr>
+        <w:ind w:left="5760" w:hanging="360"/>
+      </w:pPr>
+    </w:lvl>
+    <w:lvl w:ilvl="8" w:tplc="080A001B" w:tentative="1">
+      <w:start w:val="1"/>
+      <w:numFmt w:val="lowerRoman"/>
+      <w:lvlText w:val="%9."/>
+      <w:lvlJc w:val="right"/>
+      <w:pPr>
+        <w:ind w:left="6480" w:hanging="180"/>
+      </w:pPr>
+    </w:lvl>
+  </w:abstractNum>
+  <w:abstractNum w:abstractNumId="18" w15:restartNumberingAfterBreak="0">
     <w:nsid w:val="1DFE47A8"/>
     <w:multiLevelType w:val="hybridMultilevel"/>
     <w:tmpl w:val="89BEC470"/>
@@ -27441,7 +28046,7 @@
       </w:rPr>
     </w:lvl>
   </w:abstractNum>
-  <w:abstractNum w:abstractNumId="17" w15:restartNumberingAfterBreak="0">
+  <w:abstractNum w:abstractNumId="19" w15:restartNumberingAfterBreak="0">
     <w:nsid w:val="21464598"/>
     <w:multiLevelType w:val="hybridMultilevel"/>
     <w:tmpl w:val="15244440"/>
@@ -27553,7 +28158,120 @@
       </w:rPr>
     </w:lvl>
   </w:abstractNum>
-  <w:abstractNum w:abstractNumId="18" w15:restartNumberingAfterBreak="0">
+  <w:abstractNum w:abstractNumId="20" w15:restartNumberingAfterBreak="0">
+    <w:nsid w:val="214937D6"/>
+    <w:multiLevelType w:val="hybridMultilevel"/>
+    <w:tmpl w:val="9814C88E"/>
+    <w:lvl w:ilvl="0" w:tplc="080A0001">
+      <w:start w:val="1"/>
+      <w:numFmt w:val="bullet"/>
+      <w:lvlText w:val=""/>
+      <w:lvlJc w:val="left"/>
+      <w:pPr>
+        <w:ind w:left="1068" w:hanging="360"/>
+      </w:pPr>
+      <w:rPr>
+        <w:rFonts w:ascii="Symbol" w:hAnsi="Symbol" w:hint="default"/>
+      </w:rPr>
+    </w:lvl>
+    <w:lvl w:ilvl="1" w:tplc="080A0003" w:tentative="1">
+      <w:start w:val="1"/>
+      <w:numFmt w:val="bullet"/>
+      <w:lvlText w:val="o"/>
+      <w:lvlJc w:val="left"/>
+      <w:pPr>
+        <w:ind w:left="1788" w:hanging="360"/>
+      </w:pPr>
+      <w:rPr>
+        <w:rFonts w:ascii="Courier New" w:hAnsi="Courier New" w:cs="Courier New" w:hint="default"/>
+      </w:rPr>
+    </w:lvl>
+    <w:lvl w:ilvl="2" w:tplc="080A0005" w:tentative="1">
+      <w:start w:val="1"/>
+      <w:numFmt w:val="bullet"/>
+      <w:lvlText w:val=""/>
+      <w:lvlJc w:val="left"/>
+      <w:pPr>
+        <w:ind w:left="2508" w:hanging="360"/>
+      </w:pPr>
+      <w:rPr>
+        <w:rFonts w:ascii="Wingdings" w:hAnsi="Wingdings" w:hint="default"/>
+      </w:rPr>
+    </w:lvl>
+    <w:lvl w:ilvl="3" w:tplc="080A0001" w:tentative="1">
+      <w:start w:val="1"/>
+      <w:numFmt w:val="bullet"/>
+      <w:lvlText w:val=""/>
+      <w:lvlJc w:val="left"/>
+      <w:pPr>
+        <w:ind w:left="3228" w:hanging="360"/>
+      </w:pPr>
+      <w:rPr>
+        <w:rFonts w:ascii="Symbol" w:hAnsi="Symbol" w:hint="default"/>
+      </w:rPr>
+    </w:lvl>
+    <w:lvl w:ilvl="4" w:tplc="080A0003" w:tentative="1">
+      <w:start w:val="1"/>
+      <w:numFmt w:val="bullet"/>
+      <w:lvlText w:val="o"/>
+      <w:lvlJc w:val="left"/>
+      <w:pPr>
+        <w:ind w:left="3948" w:hanging="360"/>
+      </w:pPr>
+      <w:rPr>
+        <w:rFonts w:ascii="Courier New" w:hAnsi="Courier New" w:cs="Courier New" w:hint="default"/>
+      </w:rPr>
+    </w:lvl>
+    <w:lvl w:ilvl="5" w:tplc="080A0005" w:tentative="1">
+      <w:start w:val="1"/>
+      <w:numFmt w:val="bullet"/>
+      <w:lvlText w:val=""/>
+      <w:lvlJc w:val="left"/>
+      <w:pPr>
+        <w:ind w:left="4668" w:hanging="360"/>
+      </w:pPr>
+      <w:rPr>
+        <w:rFonts w:ascii="Wingdings" w:hAnsi="Wingdings" w:hint="default"/>
+      </w:rPr>
+    </w:lvl>
+    <w:lvl w:ilvl="6" w:tplc="080A0001" w:tentative="1">
+      <w:start w:val="1"/>
+      <w:numFmt w:val="bullet"/>
+      <w:lvlText w:val=""/>
+      <w:lvlJc w:val="left"/>
+      <w:pPr>
+        <w:ind w:left="5388" w:hanging="360"/>
+      </w:pPr>
+      <w:rPr>
+        <w:rFonts w:ascii="Symbol" w:hAnsi="Symbol" w:hint="default"/>
+      </w:rPr>
+    </w:lvl>
+    <w:lvl w:ilvl="7" w:tplc="080A0003" w:tentative="1">
+      <w:start w:val="1"/>
+      <w:numFmt w:val="bullet"/>
+      <w:lvlText w:val="o"/>
+      <w:lvlJc w:val="left"/>
+      <w:pPr>
+        <w:ind w:left="6108" w:hanging="360"/>
+      </w:pPr>
+      <w:rPr>
+        <w:rFonts w:ascii="Courier New" w:hAnsi="Courier New" w:cs="Courier New" w:hint="default"/>
+      </w:rPr>
+    </w:lvl>
+    <w:lvl w:ilvl="8" w:tplc="080A0005" w:tentative="1">
+      <w:start w:val="1"/>
+      <w:numFmt w:val="bullet"/>
+      <w:lvlText w:val=""/>
+      <w:lvlJc w:val="left"/>
+      <w:pPr>
+        <w:ind w:left="6828" w:hanging="360"/>
+      </w:pPr>
+      <w:rPr>
+        <w:rFonts w:ascii="Wingdings" w:hAnsi="Wingdings" w:hint="default"/>
+      </w:rPr>
+    </w:lvl>
+  </w:abstractNum>
+  <w:abstractNum w:abstractNumId="21" w15:restartNumberingAfterBreak="0">
     <w:nsid w:val="25124CE0"/>
     <w:multiLevelType w:val="hybridMultilevel"/>
     <w:tmpl w:val="9EF6F330"/>
@@ -27665,7 +28383,7 @@
       </w:rPr>
     </w:lvl>
   </w:abstractNum>
-  <w:abstractNum w:abstractNumId="19" w15:restartNumberingAfterBreak="0">
+  <w:abstractNum w:abstractNumId="22" w15:restartNumberingAfterBreak="0">
     <w:nsid w:val="251C641A"/>
     <w:multiLevelType w:val="hybridMultilevel"/>
     <w:tmpl w:val="2C6E000E"/>
@@ -27777,7 +28495,7 @@
       </w:rPr>
     </w:lvl>
   </w:abstractNum>
-  <w:abstractNum w:abstractNumId="20" w15:restartNumberingAfterBreak="0">
+  <w:abstractNum w:abstractNumId="23" w15:restartNumberingAfterBreak="0">
     <w:nsid w:val="2EFE77C1"/>
     <w:multiLevelType w:val="hybridMultilevel"/>
     <w:tmpl w:val="01E4FE50"/>
@@ -27889,7 +28607,7 @@
       </w:rPr>
     </w:lvl>
   </w:abstractNum>
-  <w:abstractNum w:abstractNumId="21" w15:restartNumberingAfterBreak="0">
+  <w:abstractNum w:abstractNumId="24" w15:restartNumberingAfterBreak="0">
     <w:nsid w:val="2F05141B"/>
     <w:multiLevelType w:val="hybridMultilevel"/>
     <w:tmpl w:val="AE0454CE"/>
@@ -28002,7 +28720,7 @@
       </w:rPr>
     </w:lvl>
   </w:abstractNum>
-  <w:abstractNum w:abstractNumId="22" w15:restartNumberingAfterBreak="0">
+  <w:abstractNum w:abstractNumId="25" w15:restartNumberingAfterBreak="0">
     <w:nsid w:val="2F90670E"/>
     <w:multiLevelType w:val="hybridMultilevel"/>
     <w:tmpl w:val="FEC8FCDE"/>
@@ -28114,7 +28832,7 @@
       </w:rPr>
     </w:lvl>
   </w:abstractNum>
-  <w:abstractNum w:abstractNumId="23" w15:restartNumberingAfterBreak="0">
+  <w:abstractNum w:abstractNumId="26" w15:restartNumberingAfterBreak="0">
     <w:nsid w:val="2FFD3923"/>
     <w:multiLevelType w:val="hybridMultilevel"/>
     <w:tmpl w:val="84F07482"/>
@@ -28226,7 +28944,7 @@
       </w:rPr>
     </w:lvl>
   </w:abstractNum>
-  <w:abstractNum w:abstractNumId="24" w15:restartNumberingAfterBreak="0">
+  <w:abstractNum w:abstractNumId="27" w15:restartNumberingAfterBreak="0">
     <w:nsid w:val="320E6E27"/>
     <w:multiLevelType w:val="hybridMultilevel"/>
     <w:tmpl w:val="582021FA"/>
@@ -28338,7 +29056,7 @@
       </w:rPr>
     </w:lvl>
   </w:abstractNum>
-  <w:abstractNum w:abstractNumId="25" w15:restartNumberingAfterBreak="0">
+  <w:abstractNum w:abstractNumId="28" w15:restartNumberingAfterBreak="0">
     <w:nsid w:val="32E250A9"/>
     <w:multiLevelType w:val="hybridMultilevel"/>
     <w:tmpl w:val="E5381890"/>
@@ -28450,7 +29168,7 @@
       </w:rPr>
     </w:lvl>
   </w:abstractNum>
-  <w:abstractNum w:abstractNumId="26" w15:restartNumberingAfterBreak="0">
+  <w:abstractNum w:abstractNumId="29" w15:restartNumberingAfterBreak="0">
     <w:nsid w:val="33A202B9"/>
     <w:multiLevelType w:val="hybridMultilevel"/>
     <w:tmpl w:val="52D88010"/>
@@ -28562,7 +29280,7 @@
       </w:rPr>
     </w:lvl>
   </w:abstractNum>
-  <w:abstractNum w:abstractNumId="27" w15:restartNumberingAfterBreak="0">
+  <w:abstractNum w:abstractNumId="30" w15:restartNumberingAfterBreak="0">
     <w:nsid w:val="349200F5"/>
     <w:multiLevelType w:val="hybridMultilevel"/>
     <w:tmpl w:val="AFDAD9DE"/>
@@ -28674,7 +29392,7 @@
       </w:rPr>
     </w:lvl>
   </w:abstractNum>
-  <w:abstractNum w:abstractNumId="28" w15:restartNumberingAfterBreak="0">
+  <w:abstractNum w:abstractNumId="31" w15:restartNumberingAfterBreak="0">
     <w:nsid w:val="34D218F0"/>
     <w:multiLevelType w:val="hybridMultilevel"/>
     <w:tmpl w:val="8070AFA4"/>
@@ -28786,7 +29504,7 @@
       </w:rPr>
     </w:lvl>
   </w:abstractNum>
-  <w:abstractNum w:abstractNumId="29" w15:restartNumberingAfterBreak="0">
+  <w:abstractNum w:abstractNumId="32" w15:restartNumberingAfterBreak="0">
     <w:nsid w:val="3520386A"/>
     <w:multiLevelType w:val="multilevel"/>
     <w:tmpl w:val="72D0393A"/>
@@ -28880,7 +29598,7 @@
       </w:pPr>
     </w:lvl>
   </w:abstractNum>
-  <w:abstractNum w:abstractNumId="30" w15:restartNumberingAfterBreak="0">
+  <w:abstractNum w:abstractNumId="33" w15:restartNumberingAfterBreak="0">
     <w:nsid w:val="3A2859E2"/>
     <w:multiLevelType w:val="hybridMultilevel"/>
     <w:tmpl w:val="19380252"/>
@@ -28993,7 +29711,7 @@
       </w:rPr>
     </w:lvl>
   </w:abstractNum>
-  <w:abstractNum w:abstractNumId="31" w15:restartNumberingAfterBreak="0">
+  <w:abstractNum w:abstractNumId="34" w15:restartNumberingAfterBreak="0">
     <w:nsid w:val="3C0C698D"/>
     <w:multiLevelType w:val="hybridMultilevel"/>
     <w:tmpl w:val="C3E0F372"/>
@@ -29105,7 +29823,7 @@
       </w:rPr>
     </w:lvl>
   </w:abstractNum>
-  <w:abstractNum w:abstractNumId="32" w15:restartNumberingAfterBreak="0">
+  <w:abstractNum w:abstractNumId="35" w15:restartNumberingAfterBreak="0">
     <w:nsid w:val="3DDC622F"/>
     <w:multiLevelType w:val="hybridMultilevel"/>
     <w:tmpl w:val="48D0D184"/>
@@ -29217,7 +29935,7 @@
       </w:rPr>
     </w:lvl>
   </w:abstractNum>
-  <w:abstractNum w:abstractNumId="33" w15:restartNumberingAfterBreak="0">
+  <w:abstractNum w:abstractNumId="36" w15:restartNumberingAfterBreak="0">
     <w:nsid w:val="3FF42A4F"/>
     <w:multiLevelType w:val="hybridMultilevel"/>
     <w:tmpl w:val="421EF0BC"/>
@@ -29329,7 +30047,7 @@
       </w:rPr>
     </w:lvl>
   </w:abstractNum>
-  <w:abstractNum w:abstractNumId="34" w15:restartNumberingAfterBreak="0">
+  <w:abstractNum w:abstractNumId="37" w15:restartNumberingAfterBreak="0">
     <w:nsid w:val="4A1B3E28"/>
     <w:multiLevelType w:val="hybridMultilevel"/>
     <w:tmpl w:val="11A0952C"/>
@@ -29441,7 +30159,7 @@
       </w:rPr>
     </w:lvl>
   </w:abstractNum>
-  <w:abstractNum w:abstractNumId="35" w15:restartNumberingAfterBreak="0">
+  <w:abstractNum w:abstractNumId="38" w15:restartNumberingAfterBreak="0">
     <w:nsid w:val="4C4F344B"/>
     <w:multiLevelType w:val="hybridMultilevel"/>
     <w:tmpl w:val="DCFA1302"/>
@@ -29553,7 +30271,7 @@
       </w:rPr>
     </w:lvl>
   </w:abstractNum>
-  <w:abstractNum w:abstractNumId="36" w15:restartNumberingAfterBreak="0">
+  <w:abstractNum w:abstractNumId="39" w15:restartNumberingAfterBreak="0">
     <w:nsid w:val="4F5420DB"/>
     <w:multiLevelType w:val="hybridMultilevel"/>
     <w:tmpl w:val="75C2F00C"/>
@@ -29665,7 +30383,7 @@
       </w:rPr>
     </w:lvl>
   </w:abstractNum>
-  <w:abstractNum w:abstractNumId="37" w15:restartNumberingAfterBreak="0">
+  <w:abstractNum w:abstractNumId="40" w15:restartNumberingAfterBreak="0">
     <w:nsid w:val="4FDE3B30"/>
     <w:multiLevelType w:val="multilevel"/>
     <w:tmpl w:val="C1A2D564"/>
@@ -29806,7 +30524,7 @@
       </w:rPr>
     </w:lvl>
   </w:abstractNum>
-  <w:abstractNum w:abstractNumId="38" w15:restartNumberingAfterBreak="0">
+  <w:abstractNum w:abstractNumId="41" w15:restartNumberingAfterBreak="0">
     <w:nsid w:val="51E21AFA"/>
     <w:multiLevelType w:val="hybridMultilevel"/>
     <w:tmpl w:val="13F2A440"/>
@@ -29918,7 +30636,7 @@
       </w:rPr>
     </w:lvl>
   </w:abstractNum>
-  <w:abstractNum w:abstractNumId="39" w15:restartNumberingAfterBreak="0">
+  <w:abstractNum w:abstractNumId="42" w15:restartNumberingAfterBreak="0">
     <w:nsid w:val="530A6405"/>
     <w:multiLevelType w:val="hybridMultilevel"/>
     <w:tmpl w:val="D4208D4E"/>
@@ -30030,7 +30748,7 @@
       </w:rPr>
     </w:lvl>
   </w:abstractNum>
-  <w:abstractNum w:abstractNumId="40" w15:restartNumberingAfterBreak="0">
+  <w:abstractNum w:abstractNumId="43" w15:restartNumberingAfterBreak="0">
     <w:nsid w:val="55D933FB"/>
     <w:multiLevelType w:val="hybridMultilevel"/>
     <w:tmpl w:val="1B7CD70A"/>
@@ -30142,7 +30860,96 @@
       </w:rPr>
     </w:lvl>
   </w:abstractNum>
-  <w:abstractNum w:abstractNumId="41" w15:restartNumberingAfterBreak="0">
+  <w:abstractNum w:abstractNumId="44" w15:restartNumberingAfterBreak="0">
+    <w:nsid w:val="57C85E4A"/>
+    <w:multiLevelType w:val="hybridMultilevel"/>
+    <w:tmpl w:val="5C26A9C8"/>
+    <w:lvl w:ilvl="0" w:tplc="080A000F">
+      <w:start w:val="1"/>
+      <w:numFmt w:val="decimal"/>
+      <w:lvlText w:val="%1."/>
+      <w:lvlJc w:val="left"/>
+      <w:pPr>
+        <w:ind w:left="720" w:hanging="360"/>
+      </w:pPr>
+      <w:rPr>
+        <w:rFonts w:hint="default"/>
+      </w:rPr>
+    </w:lvl>
+    <w:lvl w:ilvl="1" w:tplc="080A0019" w:tentative="1">
+      <w:start w:val="1"/>
+      <w:numFmt w:val="lowerLetter"/>
+      <w:lvlText w:val="%2."/>
+      <w:lvlJc w:val="left"/>
+      <w:pPr>
+        <w:ind w:left="1440" w:hanging="360"/>
+      </w:pPr>
+    </w:lvl>
+    <w:lvl w:ilvl="2" w:tplc="080A001B" w:tentative="1">
+      <w:start w:val="1"/>
+      <w:numFmt w:val="lowerRoman"/>
+      <w:lvlText w:val="%3."/>
+      <w:lvlJc w:val="right"/>
+      <w:pPr>
+        <w:ind w:left="2160" w:hanging="180"/>
+      </w:pPr>
+    </w:lvl>
+    <w:lvl w:ilvl="3" w:tplc="080A000F" w:tentative="1">
+      <w:start w:val="1"/>
+      <w:numFmt w:val="decimal"/>
+      <w:lvlText w:val="%4."/>
+      <w:lvlJc w:val="left"/>
+      <w:pPr>
+        <w:ind w:left="2880" w:hanging="360"/>
+      </w:pPr>
+    </w:lvl>
+    <w:lvl w:ilvl="4" w:tplc="080A0019" w:tentative="1">
+      <w:start w:val="1"/>
+      <w:numFmt w:val="lowerLetter"/>
+      <w:lvlText w:val="%5."/>
+      <w:lvlJc w:val="left"/>
+      <w:pPr>
+        <w:ind w:left="3600" w:hanging="360"/>
+      </w:pPr>
+    </w:lvl>
+    <w:lvl w:ilvl="5" w:tplc="080A001B" w:tentative="1">
+      <w:start w:val="1"/>
+      <w:numFmt w:val="lowerRoman"/>
+      <w:lvlText w:val="%6."/>
+      <w:lvlJc w:val="right"/>
+      <w:pPr>
+        <w:ind w:left="4320" w:hanging="180"/>
+      </w:pPr>
+    </w:lvl>
+    <w:lvl w:ilvl="6" w:tplc="080A000F" w:tentative="1">
+      <w:start w:val="1"/>
+      <w:numFmt w:val="decimal"/>
+      <w:lvlText w:val="%7."/>
+      <w:lvlJc w:val="left"/>
+      <w:pPr>
+        <w:ind w:left="5040" w:hanging="360"/>
+      </w:pPr>
+    </w:lvl>
+    <w:lvl w:ilvl="7" w:tplc="080A0019" w:tentative="1">
+      <w:start w:val="1"/>
+      <w:numFmt w:val="lowerLetter"/>
+      <w:lvlText w:val="%8."/>
+      <w:lvlJc w:val="left"/>
+      <w:pPr>
+        <w:ind w:left="5760" w:hanging="360"/>
+      </w:pPr>
+    </w:lvl>
+    <w:lvl w:ilvl="8" w:tplc="080A001B" w:tentative="1">
+      <w:start w:val="1"/>
+      <w:numFmt w:val="lowerRoman"/>
+      <w:lvlText w:val="%9."/>
+      <w:lvlJc w:val="right"/>
+      <w:pPr>
+        <w:ind w:left="6480" w:hanging="180"/>
+      </w:pPr>
+    </w:lvl>
+  </w:abstractNum>
+  <w:abstractNum w:abstractNumId="45" w15:restartNumberingAfterBreak="0">
     <w:nsid w:val="64851D42"/>
     <w:multiLevelType w:val="hybridMultilevel"/>
     <w:tmpl w:val="6D2A54F6"/>
@@ -30229,7 +31036,7 @@
       </w:pPr>
     </w:lvl>
   </w:abstractNum>
-  <w:abstractNum w:abstractNumId="42" w15:restartNumberingAfterBreak="0">
+  <w:abstractNum w:abstractNumId="46" w15:restartNumberingAfterBreak="0">
     <w:nsid w:val="64AD10E9"/>
     <w:multiLevelType w:val="hybridMultilevel"/>
     <w:tmpl w:val="B3544DC2"/>
@@ -30341,7 +31148,7 @@
       </w:rPr>
     </w:lvl>
   </w:abstractNum>
-  <w:abstractNum w:abstractNumId="43" w15:restartNumberingAfterBreak="0">
+  <w:abstractNum w:abstractNumId="47" w15:restartNumberingAfterBreak="0">
     <w:nsid w:val="64E16876"/>
     <w:multiLevelType w:val="hybridMultilevel"/>
     <w:tmpl w:val="9AB0B870"/>
@@ -30453,7 +31260,96 @@
       </w:rPr>
     </w:lvl>
   </w:abstractNum>
-  <w:abstractNum w:abstractNumId="44" w15:restartNumberingAfterBreak="0">
+  <w:abstractNum w:abstractNumId="48" w15:restartNumberingAfterBreak="0">
+    <w:nsid w:val="66A87AD4"/>
+    <w:multiLevelType w:val="hybridMultilevel"/>
+    <w:tmpl w:val="6C2A0F32"/>
+    <w:lvl w:ilvl="0" w:tplc="080A000F">
+      <w:start w:val="1"/>
+      <w:numFmt w:val="decimal"/>
+      <w:lvlText w:val="%1."/>
+      <w:lvlJc w:val="left"/>
+      <w:pPr>
+        <w:ind w:left="720" w:hanging="360"/>
+      </w:pPr>
+      <w:rPr>
+        <w:rFonts w:hint="default"/>
+      </w:rPr>
+    </w:lvl>
+    <w:lvl w:ilvl="1" w:tplc="080A0019" w:tentative="1">
+      <w:start w:val="1"/>
+      <w:numFmt w:val="lowerLetter"/>
+      <w:lvlText w:val="%2."/>
+      <w:lvlJc w:val="left"/>
+      <w:pPr>
+        <w:ind w:left="1440" w:hanging="360"/>
+      </w:pPr>
+    </w:lvl>
+    <w:lvl w:ilvl="2" w:tplc="080A001B" w:tentative="1">
+      <w:start w:val="1"/>
+      <w:numFmt w:val="lowerRoman"/>
+      <w:lvlText w:val="%3."/>
+      <w:lvlJc w:val="right"/>
+      <w:pPr>
+        <w:ind w:left="2160" w:hanging="180"/>
+      </w:pPr>
+    </w:lvl>
+    <w:lvl w:ilvl="3" w:tplc="080A000F" w:tentative="1">
+      <w:start w:val="1"/>
+      <w:numFmt w:val="decimal"/>
+      <w:lvlText w:val="%4."/>
+      <w:lvlJc w:val="left"/>
+      <w:pPr>
+        <w:ind w:left="2880" w:hanging="360"/>
+      </w:pPr>
+    </w:lvl>
+    <w:lvl w:ilvl="4" w:tplc="080A0019" w:tentative="1">
+      <w:start w:val="1"/>
+      <w:numFmt w:val="lowerLetter"/>
+      <w:lvlText w:val="%5."/>
+      <w:lvlJc w:val="left"/>
+      <w:pPr>
+        <w:ind w:left="3600" w:hanging="360"/>
+      </w:pPr>
+    </w:lvl>
+    <w:lvl w:ilvl="5" w:tplc="080A001B" w:tentative="1">
+      <w:start w:val="1"/>
+      <w:numFmt w:val="lowerRoman"/>
+      <w:lvlText w:val="%6."/>
+      <w:lvlJc w:val="right"/>
+      <w:pPr>
+        <w:ind w:left="4320" w:hanging="180"/>
+      </w:pPr>
+    </w:lvl>
+    <w:lvl w:ilvl="6" w:tplc="080A000F" w:tentative="1">
+      <w:start w:val="1"/>
+      <w:numFmt w:val="decimal"/>
+      <w:lvlText w:val="%7."/>
+      <w:lvlJc w:val="left"/>
+      <w:pPr>
+        <w:ind w:left="5040" w:hanging="360"/>
+      </w:pPr>
+    </w:lvl>
+    <w:lvl w:ilvl="7" w:tplc="080A0019" w:tentative="1">
+      <w:start w:val="1"/>
+      <w:numFmt w:val="lowerLetter"/>
+      <w:lvlText w:val="%8."/>
+      <w:lvlJc w:val="left"/>
+      <w:pPr>
+        <w:ind w:left="5760" w:hanging="360"/>
+      </w:pPr>
+    </w:lvl>
+    <w:lvl w:ilvl="8" w:tplc="080A001B" w:tentative="1">
+      <w:start w:val="1"/>
+      <w:numFmt w:val="lowerRoman"/>
+      <w:lvlText w:val="%9."/>
+      <w:lvlJc w:val="right"/>
+      <w:pPr>
+        <w:ind w:left="6480" w:hanging="180"/>
+      </w:pPr>
+    </w:lvl>
+  </w:abstractNum>
+  <w:abstractNum w:abstractNumId="49" w15:restartNumberingAfterBreak="0">
     <w:nsid w:val="691354BE"/>
     <w:multiLevelType w:val="hybridMultilevel"/>
     <w:tmpl w:val="8AD0F5E2"/>
@@ -30565,7 +31461,7 @@
       </w:rPr>
     </w:lvl>
   </w:abstractNum>
-  <w:abstractNum w:abstractNumId="45" w15:restartNumberingAfterBreak="0">
+  <w:abstractNum w:abstractNumId="50" w15:restartNumberingAfterBreak="0">
     <w:nsid w:val="69F35528"/>
     <w:multiLevelType w:val="hybridMultilevel"/>
     <w:tmpl w:val="CE36774E"/>
@@ -30677,7 +31573,7 @@
       </w:rPr>
     </w:lvl>
   </w:abstractNum>
-  <w:abstractNum w:abstractNumId="46" w15:restartNumberingAfterBreak="0">
+  <w:abstractNum w:abstractNumId="51" w15:restartNumberingAfterBreak="0">
     <w:nsid w:val="6A301093"/>
     <w:multiLevelType w:val="hybridMultilevel"/>
     <w:tmpl w:val="B5E4901E"/>
@@ -30789,7 +31685,7 @@
       </w:rPr>
     </w:lvl>
   </w:abstractNum>
-  <w:abstractNum w:abstractNumId="47" w15:restartNumberingAfterBreak="0">
+  <w:abstractNum w:abstractNumId="52" w15:restartNumberingAfterBreak="0">
     <w:nsid w:val="6BCF415C"/>
     <w:multiLevelType w:val="hybridMultilevel"/>
     <w:tmpl w:val="6D12CD26"/>
@@ -30901,7 +31797,7 @@
       </w:rPr>
     </w:lvl>
   </w:abstractNum>
-  <w:abstractNum w:abstractNumId="48" w15:restartNumberingAfterBreak="0">
+  <w:abstractNum w:abstractNumId="53" w15:restartNumberingAfterBreak="0">
     <w:nsid w:val="6C0F5B54"/>
     <w:multiLevelType w:val="hybridMultilevel"/>
     <w:tmpl w:val="8196BE62"/>
@@ -31013,7 +31909,7 @@
       </w:rPr>
     </w:lvl>
   </w:abstractNum>
-  <w:abstractNum w:abstractNumId="49" w15:restartNumberingAfterBreak="0">
+  <w:abstractNum w:abstractNumId="54" w15:restartNumberingAfterBreak="0">
     <w:nsid w:val="6E946A08"/>
     <w:multiLevelType w:val="multilevel"/>
     <w:tmpl w:val="90EE6564"/>
@@ -31103,7 +31999,7 @@
       </w:pPr>
     </w:lvl>
   </w:abstractNum>
-  <w:abstractNum w:abstractNumId="50" w15:restartNumberingAfterBreak="0">
+  <w:abstractNum w:abstractNumId="55" w15:restartNumberingAfterBreak="0">
     <w:nsid w:val="7765261C"/>
     <w:multiLevelType w:val="hybridMultilevel"/>
     <w:tmpl w:val="B7EA0C7C"/>
@@ -31215,7 +32111,7 @@
       </w:rPr>
     </w:lvl>
   </w:abstractNum>
-  <w:abstractNum w:abstractNumId="51" w15:restartNumberingAfterBreak="0">
+  <w:abstractNum w:abstractNumId="56" w15:restartNumberingAfterBreak="0">
     <w:nsid w:val="78F46FEB"/>
     <w:multiLevelType w:val="hybridMultilevel"/>
     <w:tmpl w:val="C30AF1C6"/>
@@ -31327,7 +32223,7 @@
       </w:rPr>
     </w:lvl>
   </w:abstractNum>
-  <w:abstractNum w:abstractNumId="52" w15:restartNumberingAfterBreak="0">
+  <w:abstractNum w:abstractNumId="57" w15:restartNumberingAfterBreak="0">
     <w:nsid w:val="791F6B78"/>
     <w:multiLevelType w:val="hybridMultilevel"/>
     <w:tmpl w:val="AC5A7854"/>
@@ -31439,7 +32335,120 @@
       </w:rPr>
     </w:lvl>
   </w:abstractNum>
-  <w:abstractNum w:abstractNumId="53" w15:restartNumberingAfterBreak="0">
+  <w:abstractNum w:abstractNumId="58" w15:restartNumberingAfterBreak="0">
+    <w:nsid w:val="7A625237"/>
+    <w:multiLevelType w:val="hybridMultilevel"/>
+    <w:tmpl w:val="7F28AD08"/>
+    <w:lvl w:ilvl="0" w:tplc="080A0001">
+      <w:start w:val="1"/>
+      <w:numFmt w:val="bullet"/>
+      <w:lvlText w:val=""/>
+      <w:lvlJc w:val="left"/>
+      <w:pPr>
+        <w:ind w:left="720" w:hanging="360"/>
+      </w:pPr>
+      <w:rPr>
+        <w:rFonts w:ascii="Symbol" w:hAnsi="Symbol" w:hint="default"/>
+      </w:rPr>
+    </w:lvl>
+    <w:lvl w:ilvl="1" w:tplc="080A0003" w:tentative="1">
+      <w:start w:val="1"/>
+      <w:numFmt w:val="bullet"/>
+      <w:lvlText w:val="o"/>
+      <w:lvlJc w:val="left"/>
+      <w:pPr>
+        <w:ind w:left="1440" w:hanging="360"/>
+      </w:pPr>
+      <w:rPr>
+        <w:rFonts w:ascii="Courier New" w:hAnsi="Courier New" w:cs="Courier New" w:hint="default"/>
+      </w:rPr>
+    </w:lvl>
+    <w:lvl w:ilvl="2" w:tplc="080A0005" w:tentative="1">
+      <w:start w:val="1"/>
+      <w:numFmt w:val="bullet"/>
+      <w:lvlText w:val=""/>
+      <w:lvlJc w:val="left"/>
+      <w:pPr>
+        <w:ind w:left="2160" w:hanging="360"/>
+      </w:pPr>
+      <w:rPr>
+        <w:rFonts w:ascii="Wingdings" w:hAnsi="Wingdings" w:hint="default"/>
+      </w:rPr>
+    </w:lvl>
+    <w:lvl w:ilvl="3" w:tplc="080A0001" w:tentative="1">
+      <w:start w:val="1"/>
+      <w:numFmt w:val="bullet"/>
+      <w:lvlText w:val=""/>
+      <w:lvlJc w:val="left"/>
+      <w:pPr>
+        <w:ind w:left="2880" w:hanging="360"/>
+      </w:pPr>
+      <w:rPr>
+        <w:rFonts w:ascii="Symbol" w:hAnsi="Symbol" w:hint="default"/>
+      </w:rPr>
+    </w:lvl>
+    <w:lvl w:ilvl="4" w:tplc="080A0003" w:tentative="1">
+      <w:start w:val="1"/>
+      <w:numFmt w:val="bullet"/>
+      <w:lvlText w:val="o"/>
+      <w:lvlJc w:val="left"/>
+      <w:pPr>
+        <w:ind w:left="3600" w:hanging="360"/>
+      </w:pPr>
+      <w:rPr>
+        <w:rFonts w:ascii="Courier New" w:hAnsi="Courier New" w:cs="Courier New" w:hint="default"/>
+      </w:rPr>
+    </w:lvl>
+    <w:lvl w:ilvl="5" w:tplc="080A0005" w:tentative="1">
+      <w:start w:val="1"/>
+      <w:numFmt w:val="bullet"/>
+      <w:lvlText w:val=""/>
+      <w:lvlJc w:val="left"/>
+      <w:pPr>
+        <w:ind w:left="4320" w:hanging="360"/>
+      </w:pPr>
+      <w:rPr>
+        <w:rFonts w:ascii="Wingdings" w:hAnsi="Wingdings" w:hint="default"/>
+      </w:rPr>
+    </w:lvl>
+    <w:lvl w:ilvl="6" w:tplc="080A0001" w:tentative="1">
+      <w:start w:val="1"/>
+      <w:numFmt w:val="bullet"/>
+      <w:lvlText w:val=""/>
+      <w:lvlJc w:val="left"/>
+      <w:pPr>
+        <w:ind w:left="5040" w:hanging="360"/>
+      </w:pPr>
+      <w:rPr>
+        <w:rFonts w:ascii="Symbol" w:hAnsi="Symbol" w:hint="default"/>
+      </w:rPr>
+    </w:lvl>
+    <w:lvl w:ilvl="7" w:tplc="080A0003" w:tentative="1">
+      <w:start w:val="1"/>
+      <w:numFmt w:val="bullet"/>
+      <w:lvlText w:val="o"/>
+      <w:lvlJc w:val="left"/>
+      <w:pPr>
+        <w:ind w:left="5760" w:hanging="360"/>
+      </w:pPr>
+      <w:rPr>
+        <w:rFonts w:ascii="Courier New" w:hAnsi="Courier New" w:cs="Courier New" w:hint="default"/>
+      </w:rPr>
+    </w:lvl>
+    <w:lvl w:ilvl="8" w:tplc="080A0005" w:tentative="1">
+      <w:start w:val="1"/>
+      <w:numFmt w:val="bullet"/>
+      <w:lvlText w:val=""/>
+      <w:lvlJc w:val="left"/>
+      <w:pPr>
+        <w:ind w:left="6480" w:hanging="360"/>
+      </w:pPr>
+      <w:rPr>
+        <w:rFonts w:ascii="Wingdings" w:hAnsi="Wingdings" w:hint="default"/>
+      </w:rPr>
+    </w:lvl>
+  </w:abstractNum>
+  <w:abstractNum w:abstractNumId="59" w15:restartNumberingAfterBreak="0">
     <w:nsid w:val="7AF968DB"/>
     <w:multiLevelType w:val="hybridMultilevel"/>
     <w:tmpl w:val="60E22498"/>
@@ -31552,7 +32561,7 @@
       </w:rPr>
     </w:lvl>
   </w:abstractNum>
-  <w:abstractNum w:abstractNumId="54" w15:restartNumberingAfterBreak="0">
+  <w:abstractNum w:abstractNumId="60" w15:restartNumberingAfterBreak="0">
     <w:nsid w:val="7EB24424"/>
     <w:multiLevelType w:val="hybridMultilevel"/>
     <w:tmpl w:val="156E5E14"/>
@@ -31666,169 +32675,187 @@
     </w:lvl>
   </w:abstractNum>
   <w:num w:numId="1" w16cid:durableId="1456876180">
-    <w:abstractNumId w:val="29"/>
+    <w:abstractNumId w:val="32"/>
   </w:num>
   <w:num w:numId="2" w16cid:durableId="504054103">
-    <w:abstractNumId w:val="41"/>
+    <w:abstractNumId w:val="45"/>
   </w:num>
   <w:num w:numId="3" w16cid:durableId="324742561">
-    <w:abstractNumId w:val="49"/>
+    <w:abstractNumId w:val="54"/>
   </w:num>
   <w:num w:numId="4" w16cid:durableId="932250197">
     <w:abstractNumId w:val="3"/>
   </w:num>
   <w:num w:numId="5" w16cid:durableId="582421713">
-    <w:abstractNumId w:val="37"/>
+    <w:abstractNumId w:val="40"/>
   </w:num>
   <w:num w:numId="6" w16cid:durableId="728957894">
-    <w:abstractNumId w:val="53"/>
+    <w:abstractNumId w:val="59"/>
   </w:num>
   <w:num w:numId="7" w16cid:durableId="1487741963">
-    <w:abstractNumId w:val="42"/>
+    <w:abstractNumId w:val="46"/>
   </w:num>
   <w:num w:numId="8" w16cid:durableId="216015524">
-    <w:abstractNumId w:val="22"/>
+    <w:abstractNumId w:val="25"/>
   </w:num>
   <w:num w:numId="9" w16cid:durableId="801652496">
     <w:abstractNumId w:val="12"/>
   </w:num>
   <w:num w:numId="10" w16cid:durableId="1041638905">
-    <w:abstractNumId w:val="54"/>
+    <w:abstractNumId w:val="60"/>
   </w:num>
   <w:num w:numId="11" w16cid:durableId="1432240812">
     <w:abstractNumId w:val="8"/>
   </w:num>
   <w:num w:numId="12" w16cid:durableId="97991848">
-    <w:abstractNumId w:val="30"/>
+    <w:abstractNumId w:val="33"/>
   </w:num>
   <w:num w:numId="13" w16cid:durableId="1605572963">
     <w:abstractNumId w:val="11"/>
   </w:num>
   <w:num w:numId="14" w16cid:durableId="127281280">
-    <w:abstractNumId w:val="50"/>
+    <w:abstractNumId w:val="55"/>
   </w:num>
   <w:num w:numId="15" w16cid:durableId="204603479">
-    <w:abstractNumId w:val="28"/>
+    <w:abstractNumId w:val="31"/>
   </w:num>
   <w:num w:numId="16" w16cid:durableId="259874575">
     <w:abstractNumId w:val="6"/>
   </w:num>
   <w:num w:numId="17" w16cid:durableId="299648525">
-    <w:abstractNumId w:val="23"/>
+    <w:abstractNumId w:val="26"/>
   </w:num>
   <w:num w:numId="18" w16cid:durableId="1591966103">
-    <w:abstractNumId w:val="40"/>
+    <w:abstractNumId w:val="43"/>
   </w:num>
   <w:num w:numId="19" w16cid:durableId="1408961771">
-    <w:abstractNumId w:val="38"/>
+    <w:abstractNumId w:val="41"/>
   </w:num>
   <w:num w:numId="20" w16cid:durableId="1328971368">
-    <w:abstractNumId w:val="27"/>
+    <w:abstractNumId w:val="30"/>
   </w:num>
   <w:num w:numId="21" w16cid:durableId="1142696265">
     <w:abstractNumId w:val="10"/>
   </w:num>
   <w:num w:numId="22" w16cid:durableId="1861314620">
-    <w:abstractNumId w:val="17"/>
+    <w:abstractNumId w:val="19"/>
   </w:num>
   <w:num w:numId="23" w16cid:durableId="1418214510">
-    <w:abstractNumId w:val="52"/>
+    <w:abstractNumId w:val="57"/>
   </w:num>
   <w:num w:numId="24" w16cid:durableId="1194923815">
-    <w:abstractNumId w:val="47"/>
+    <w:abstractNumId w:val="52"/>
   </w:num>
   <w:num w:numId="25" w16cid:durableId="763695929">
     <w:abstractNumId w:val="14"/>
   </w:num>
   <w:num w:numId="26" w16cid:durableId="1040008664">
-    <w:abstractNumId w:val="25"/>
+    <w:abstractNumId w:val="28"/>
   </w:num>
   <w:num w:numId="27" w16cid:durableId="1494250775">
-    <w:abstractNumId w:val="32"/>
+    <w:abstractNumId w:val="35"/>
   </w:num>
   <w:num w:numId="28" w16cid:durableId="643893783">
-    <w:abstractNumId w:val="39"/>
+    <w:abstractNumId w:val="42"/>
   </w:num>
   <w:num w:numId="29" w16cid:durableId="913011817">
-    <w:abstractNumId w:val="19"/>
+    <w:abstractNumId w:val="22"/>
   </w:num>
   <w:num w:numId="30" w16cid:durableId="282115">
     <w:abstractNumId w:val="2"/>
   </w:num>
   <w:num w:numId="31" w16cid:durableId="1864393292">
-    <w:abstractNumId w:val="33"/>
+    <w:abstractNumId w:val="36"/>
   </w:num>
   <w:num w:numId="32" w16cid:durableId="1569345129">
-    <w:abstractNumId w:val="46"/>
+    <w:abstractNumId w:val="51"/>
   </w:num>
   <w:num w:numId="33" w16cid:durableId="258880597">
-    <w:abstractNumId w:val="43"/>
+    <w:abstractNumId w:val="47"/>
   </w:num>
   <w:num w:numId="34" w16cid:durableId="836071243">
-    <w:abstractNumId w:val="44"/>
+    <w:abstractNumId w:val="49"/>
   </w:num>
   <w:num w:numId="35" w16cid:durableId="1882284531">
-    <w:abstractNumId w:val="51"/>
+    <w:abstractNumId w:val="56"/>
   </w:num>
   <w:num w:numId="36" w16cid:durableId="156656996">
-    <w:abstractNumId w:val="48"/>
+    <w:abstractNumId w:val="53"/>
   </w:num>
   <w:num w:numId="37" w16cid:durableId="1057162647">
     <w:abstractNumId w:val="13"/>
   </w:num>
   <w:num w:numId="38" w16cid:durableId="1115636491">
-    <w:abstractNumId w:val="20"/>
+    <w:abstractNumId w:val="23"/>
   </w:num>
   <w:num w:numId="39" w16cid:durableId="908617629">
-    <w:abstractNumId w:val="31"/>
+    <w:abstractNumId w:val="34"/>
   </w:num>
   <w:num w:numId="40" w16cid:durableId="907763773">
-    <w:abstractNumId w:val="36"/>
+    <w:abstractNumId w:val="39"/>
   </w:num>
   <w:num w:numId="41" w16cid:durableId="1480069667">
     <w:abstractNumId w:val="5"/>
   </w:num>
   <w:num w:numId="42" w16cid:durableId="1289775075">
-    <w:abstractNumId w:val="24"/>
+    <w:abstractNumId w:val="27"/>
   </w:num>
   <w:num w:numId="43" w16cid:durableId="684792249">
     <w:abstractNumId w:val="4"/>
   </w:num>
   <w:num w:numId="44" w16cid:durableId="2007394405">
-    <w:abstractNumId w:val="26"/>
+    <w:abstractNumId w:val="29"/>
   </w:num>
   <w:num w:numId="45" w16cid:durableId="949968118">
-    <w:abstractNumId w:val="16"/>
+    <w:abstractNumId w:val="18"/>
   </w:num>
   <w:num w:numId="46" w16cid:durableId="1601451271">
     <w:abstractNumId w:val="7"/>
   </w:num>
   <w:num w:numId="47" w16cid:durableId="1015769343">
-    <w:abstractNumId w:val="35"/>
+    <w:abstractNumId w:val="38"/>
   </w:num>
   <w:num w:numId="48" w16cid:durableId="16734387">
     <w:abstractNumId w:val="1"/>
   </w:num>
   <w:num w:numId="49" w16cid:durableId="1282028128">
-    <w:abstractNumId w:val="15"/>
+    <w:abstractNumId w:val="16"/>
   </w:num>
   <w:num w:numId="50" w16cid:durableId="1194609234">
-    <w:abstractNumId w:val="45"/>
+    <w:abstractNumId w:val="50"/>
   </w:num>
   <w:num w:numId="51" w16cid:durableId="1771705336">
-    <w:abstractNumId w:val="34"/>
+    <w:abstractNumId w:val="37"/>
   </w:num>
   <w:num w:numId="52" w16cid:durableId="167185672">
-    <w:abstractNumId w:val="18"/>
+    <w:abstractNumId w:val="21"/>
   </w:num>
   <w:num w:numId="53" w16cid:durableId="1953588822">
-    <w:abstractNumId w:val="21"/>
+    <w:abstractNumId w:val="24"/>
   </w:num>
   <w:num w:numId="54" w16cid:durableId="982077238">
     <w:abstractNumId w:val="9"/>
   </w:num>
   <w:num w:numId="55" w16cid:durableId="1590114350">
     <w:abstractNumId w:val="0"/>
+  </w:num>
+  <w:num w:numId="56" w16cid:durableId="924144836">
+    <w:abstractNumId w:val="44"/>
+  </w:num>
+  <w:num w:numId="57" w16cid:durableId="1929536424">
+    <w:abstractNumId w:val="58"/>
+  </w:num>
+  <w:num w:numId="58" w16cid:durableId="1935047143">
+    <w:abstractNumId w:val="17"/>
+  </w:num>
+  <w:num w:numId="59" w16cid:durableId="1289582928">
+    <w:abstractNumId w:val="15"/>
+  </w:num>
+  <w:num w:numId="60" w16cid:durableId="1649826352">
+    <w:abstractNumId w:val="20"/>
+  </w:num>
+  <w:num w:numId="61" w16cid:durableId="1447961986">
+    <w:abstractNumId w:val="48"/>
   </w:num>
   <w:numIdMacAtCleanup w:val="52"/>
 </w:numbering>

</xml_diff>